<commit_message>
New translations a-e-c-p.docx (Papiamento)
</commit_message>
<xml_diff>
--- a/translations/plh_facilitator_cw/pap/pap_A-E-C-P.docx
+++ b/translations/plh_facilitator_cw/pap/pap_A-E-C-P.docx
@@ -338,7 +338,7 @@
               <w:pStyle w:val="P68B1DB1-Normal3"/>
             </w:pPr>
             <w:r>
-              <w:t xml:space="preserve">Mayor/Edukadó: Mi no tabata sintí mi kómodo na kumisamentu pasobra mi tabata ke bisa mi yu kiko pa hasi. Pero despues mi a wak mi “yu” i a kuminsá djis sigui loke e tabata ke hasi. </w:t>
+              <w:t xml:space="preserve">Mayor/Edukadó: Mi no tabata sintí mi kómodo na kumisamentu pasobra mi tabata ke bisa mi yu kiko pa hasi. Pero despues mi a wak mi “yu” i a djis sigui loke e tabata ke hasi. </w:t>
             </w:r>
           </w:p>
           <w:p>
@@ -506,7 +506,7 @@
               <w:pStyle w:val="P68B1DB1-Normal3"/>
             </w:pPr>
             <w:r>
-              <w:t xml:space="preserve">Abo: Kon tabata pa sigui e ehèmpel di bo yu? Bo a nota algu diferente den e interakshon? Ki pensamentunan bo tabata eksperensiá? </w:t>
+              <w:t xml:space="preserve">Abo: Kon tabata pa sigui e ehèmpel di bo yu? Bo a nota algu diferente den e interakshon? Kiko bo tabata pensa? </w:t>
             </w:r>
           </w:p>
           <w:p>
@@ -664,7 +664,7 @@
               <w:pStyle w:val="P68B1DB1-Normal3"/>
             </w:pPr>
             <w:r>
-              <w:t xml:space="preserve">Puntra: “Kiko nos por siña for di e eksperensia akí?”</w:t>
+              <w:t xml:space="preserve">Puntra: “Kiko nos por siña for di e eksperensia aki?”</w:t>
             </w:r>
           </w:p>
           <w:p>
@@ -724,7 +724,7 @@
               <w:pStyle w:val="P68B1DB1-Normal3"/>
             </w:pPr>
             <w:r>
-              <w:t xml:space="preserve">Usa afirmashonnan manera: “Esei ta un tremendo ehèmpel kon pa krea konfiansa ku bo yu.”</w:t>
+              <w:t xml:space="preserve">Usa afirmashonnan manera: “Esei ta un hopi bon ehèmpel kon pa krea konfiansa ku bo yu.”</w:t>
             </w:r>
           </w:p>
           <w:p>
@@ -755,7 +755,7 @@
               <w:pStyle w:val="P68B1DB1-Normal3"/>
             </w:pPr>
             <w:r>
-              <w:t xml:space="preserve">Abo: Kiko nos por siña for di e eksperensia akí? [Pidi kontesta di e grupo.]  </w:t>
+              <w:t xml:space="preserve">Abo: Kiko nos por siña for di e eksperensia aki? [Pidi kontesta di e grupo.]  </w:t>
             </w:r>
           </w:p>
           <w:p>

</xml_diff>